<commit_message>
Got feedback added movement sound effects improve enemy collision code
</commit_message>
<xml_diff>
--- a/documentation/feeback.docx
+++ b/documentation/feeback.docx
@@ -129,7 +129,11 @@
           <w:tcPr>
             <w:tcW w:w="3067" w:type="dxa"/>
           </w:tcPr>
-          <w:p/>
+          <w:p>
+            <w:r>
+              <w:t>Added a door to my level. I will stop the player from moving after they have been killed.</w:t>
+            </w:r>
+          </w:p>
         </w:tc>
       </w:tr>
       <w:tr>
@@ -161,11 +165,9 @@
             <w:r>
               <w:t xml:space="preserve">Fix the map so you can tell what </w:t>
             </w:r>
-            <w:proofErr w:type="gramStart"/>
-            <w:r>
-              <w:t>is a wall</w:t>
-            </w:r>
-            <w:proofErr w:type="gramEnd"/>
+            <w:r>
+              <w:t>a wall is</w:t>
+            </w:r>
             <w:r>
               <w:t xml:space="preserve"> or not.</w:t>
             </w:r>
@@ -175,7 +177,53 @@
           <w:tcPr>
             <w:tcW w:w="3067" w:type="dxa"/>
           </w:tcPr>
-          <w:p/>
+          <w:p>
+            <w:r>
+              <w:t>Make it more obvious what is a wall in my game or not.</w:t>
+            </w:r>
+          </w:p>
+        </w:tc>
+      </w:tr>
+      <w:tr>
+        <w:tc>
+          <w:tcPr>
+            <w:tcW w:w="988" w:type="dxa"/>
+          </w:tcPr>
+          <w:p>
+            <w:r>
+              <w:t>4/04</w:t>
+            </w:r>
+          </w:p>
+        </w:tc>
+        <w:tc>
+          <w:tcPr>
+            <w:tcW w:w="2551" w:type="dxa"/>
+          </w:tcPr>
+          <w:p>
+            <w:r>
+              <w:t>Connor Flemming</w:t>
+            </w:r>
+          </w:p>
+        </w:tc>
+        <w:tc>
+          <w:tcPr>
+            <w:tcW w:w="2410" w:type="dxa"/>
+          </w:tcPr>
+          <w:p>
+            <w:r>
+              <w:t>Add background music and sounds when the player moves.</w:t>
+            </w:r>
+          </w:p>
+        </w:tc>
+        <w:tc>
+          <w:tcPr>
+            <w:tcW w:w="3067" w:type="dxa"/>
+          </w:tcPr>
+          <w:p>
+            <w:r>
+              <w:t>I will add background music and sounds when the player walks.</w:t>
+            </w:r>
+          </w:p>
         </w:tc>
       </w:tr>
     </w:tbl>

</xml_diff>